<commit_message>
Update manuscript materials and analyses
</commit_message>
<xml_diff>
--- a/manuscript_material/glossary/Glossary.docx
+++ b/manuscript_material/glossary/Glossary.docx
@@ -1734,7 +1734,7 @@
           </w:tcPr>
           <w:p>
             <w:r>
-              <w:t>62 of 100 CompBioBench tasks with one distinct answer across all 12 Galaxy runs</w:t>
+              <w:t>One distinct answer in 333 of 400 Galaxy-condition CompBioBench replicate sets; 62 of 100 tasks across all 12 Galaxy runs</w:t>
             </w:r>
           </w:p>
         </w:tc>
@@ -1744,6 +1744,110 @@
           </w:tcPr>
           <w:p>
             <w:r/>
+          </w:p>
+        </w:tc>
+      </w:tr>
+      <w:tr>
+        <w:tc>
+          <w:tcPr>
+            <w:tcW w:type="dxa" w:w="1728"/>
+          </w:tcPr>
+          <w:p>
+            <w:r>
+              <w:t>Replicate agreement</w:t>
+            </w:r>
+          </w:p>
+        </w:tc>
+        <w:tc>
+          <w:tcPr>
+            <w:tcW w:type="dxa" w:w="1728"/>
+          </w:tcPr>
+          <w:p>
+            <w:r>
+              <w:t>New</w:t>
+            </w:r>
+          </w:p>
+        </w:tc>
+        <w:tc>
+          <w:tcPr>
+            <w:tcW w:type="dxa" w:w="1728"/>
+          </w:tcPr>
+          <w:p>
+            <w:r>
+              <w:t>Umbrella term for agreement among the replicate runs of replicate sets: outcome repeatability where a verdict or score exists, answer consistency otherwise.</w:t>
+            </w:r>
+          </w:p>
+        </w:tc>
+        <w:tc>
+          <w:tcPr>
+            <w:tcW w:type="dxa" w:w="1728"/>
+          </w:tcPr>
+          <w:p>
+            <w:r>
+              <w:t>Section 3 of the Results; Fig. 4</w:t>
+            </w:r>
+          </w:p>
+        </w:tc>
+        <w:tc>
+          <w:tcPr>
+            <w:tcW w:type="dxa" w:w="1728"/>
+          </w:tcPr>
+          <w:p>
+            <w:r>
+              <w:t>reproducibility (for replicate runs)</w:t>
+            </w:r>
+          </w:p>
+        </w:tc>
+      </w:tr>
+      <w:tr>
+        <w:tc>
+          <w:tcPr>
+            <w:tcW w:type="dxa" w:w="1728"/>
+          </w:tcPr>
+          <w:p>
+            <w:r>
+              <w:t>Run-level accuracy; unanimous accuracy</w:t>
+            </w:r>
+          </w:p>
+        </w:tc>
+        <w:tc>
+          <w:tcPr>
+            <w:tcW w:type="dxa" w:w="1728"/>
+          </w:tcPr>
+          <w:p>
+            <w:r>
+              <w:t>New</w:t>
+            </w:r>
+          </w:p>
+        </w:tc>
+        <w:tc>
+          <w:tcPr>
+            <w:tcW w:type="dxa" w:w="1728"/>
+          </w:tcPr>
+          <w:p>
+            <w:r>
+              <w:t>Run-level accuracy is accuracy over runs. Unanimous accuracy is the share of BixBench-Verified-50 tasks whose three replicate runs were all scored correct (repeatability category 3/3), per model configuration and execution condition. Compare the two only over the same model configurations.</w:t>
+            </w:r>
+          </w:p>
+        </w:tc>
+        <w:tc>
+          <w:tcPr>
+            <w:tcW w:type="dxa" w:w="1728"/>
+          </w:tcPr>
+          <w:p>
+            <w:r>
+              <w:t>GPT-5.5, Galaxy condition: 89.3% run-level, 88.0% unanimous</w:t>
+            </w:r>
+          </w:p>
+        </w:tc>
+        <w:tc>
+          <w:tcPr>
+            <w:tcW w:type="dxa" w:w="1728"/>
+          </w:tcPr>
+          <w:p>
+            <w:r>
+              <w:t>strict accuracy; triplicate accuracy</w:t>
+            </w:r>
           </w:p>
         </w:tc>
       </w:tr>
@@ -3140,6 +3244,370 @@
           </w:tcPr>
           <w:p>
             <w:r>
+              <w:t>Task case</w:t>
+            </w:r>
+          </w:p>
+        </w:tc>
+        <w:tc>
+          <w:tcPr>
+            <w:tcW w:type="dxa" w:w="1728"/>
+          </w:tcPr>
+          <w:p>
+            <w:r>
+              <w:t>New</w:t>
+            </w:r>
+          </w:p>
+        </w:tc>
+        <w:tc>
+          <w:tcPr>
+            <w:tcW w:type="dxa" w:w="1728"/>
+          </w:tcPr>
+          <w:p>
+            <w:r>
+              <w:t>A task with at least one wrong, scored-incorrect or low-scoring run (plus one IWC workflow whose near-perfect output agreement concealed a changed result), audited across all of its runs. The unit of the task-level audit; each task is counted once.</w:t>
+            </w:r>
+          </w:p>
+        </w:tc>
+        <w:tc>
+          <w:tcPr>
+            <w:tcW w:type="dxa" w:w="1728"/>
+          </w:tcPr>
+          <w:p>
+            <w:r>
+              <w:t>93 task cases: 33 BixBench-Verified-50, 53 CompBioBench, 7 IWC</w:t>
+            </w:r>
+          </w:p>
+        </w:tc>
+        <w:tc>
+          <w:tcPr>
+            <w:tcW w:type="dxa" w:w="1728"/>
+          </w:tcPr>
+          <w:p>
+            <w:r>
+              <w:t>failed task; error case</w:t>
+            </w:r>
+          </w:p>
+        </w:tc>
+      </w:tr>
+      <w:tr>
+        <w:tc>
+          <w:tcPr>
+            <w:tcW w:type="dxa" w:w="1728"/>
+          </w:tcPr>
+          <w:p>
+            <w:r>
+              <w:t>Primary cause category (task case)</w:t>
+            </w:r>
+          </w:p>
+        </w:tc>
+        <w:tc>
+          <w:tcPr>
+            <w:tcW w:type="dxa" w:w="1728"/>
+          </w:tcPr>
+          <w:p>
+            <w:r>
+              <w:t>New</w:t>
+            </w:r>
+          </w:p>
+        </w:tc>
+        <w:tc>
+          <w:tcPr>
+            <w:tcW w:type="dxa" w:w="1728"/>
+          </w:tcPr>
+          <w:p>
+            <w:r>
+              <w:t>The main interpretive issue of a task case, one of eight: C1 equivalent answer expressed differently; C2 scoring or evaluator artifact; C3 reference depends on an unstated choice; C4 Galaxy platform, wrapper or server behaviour; C5 agent analysis error; C6 execution provenance or answer exposure; C7 aggregate score conceals a changed scientific conclusion; C8 completion failure. C1–C3 place the cause with the benchmark.</w:t>
+            </w:r>
+          </w:p>
+        </w:tc>
+        <w:tc>
+          <w:tcPr>
+            <w:tcW w:type="dxa" w:w="1728"/>
+          </w:tcPr>
+          <w:p>
+            <w:r>
+              <w:t>C3, reference depends on an unstated choice: 20 of 93 task cases</w:t>
+            </w:r>
+          </w:p>
+        </w:tc>
+        <w:tc>
+          <w:tcPr>
+            <w:tcW w:type="dxa" w:w="1728"/>
+          </w:tcPr>
+          <w:p>
+            <w:r>
+              <w:t>root cause (for tasks)</w:t>
+            </w:r>
+          </w:p>
+        </w:tc>
+      </w:tr>
+      <w:tr>
+        <w:tc>
+          <w:tcPr>
+            <w:tcW w:type="dxa" w:w="1728"/>
+          </w:tcPr>
+          <w:p>
+            <w:r>
+              <w:t>Integrity flag</w:t>
+            </w:r>
+          </w:p>
+        </w:tc>
+        <w:tc>
+          <w:tcPr>
+            <w:tcW w:type="dxa" w:w="1728"/>
+          </w:tcPr>
+          <w:p>
+            <w:r>
+              <w:t>New</w:t>
+            </w:r>
+          </w:p>
+        </w:tc>
+        <w:tc>
+          <w:tcPr>
+            <w:tcW w:type="dxa" w:w="1728"/>
+          </w:tcPr>
+          <w:p>
+            <w:r>
+              <w:t>A problem with how an answer was obtained, recorded in addition to the primary cause: benchmark-answer retrieval, local computation in the Galaxy condition or cross-run output reuse. A flag does not imply that the answer is wrong.</w:t>
+            </w:r>
+          </w:p>
+        </w:tc>
+        <w:tc>
+          <w:tcPr>
+            <w:tcW w:type="dxa" w:w="1728"/>
+          </w:tcPr>
+          <w:p>
+            <w:r>
+              <w:t>Benchmark-answer retrieval in 26 of 93 task cases</w:t>
+            </w:r>
+          </w:p>
+        </w:tc>
+        <w:tc>
+          <w:tcPr>
+            <w:tcW w:type="dxa" w:w="1728"/>
+          </w:tcPr>
+          <w:p>
+            <w:r>
+              <w:t>contamination (unqualified)</w:t>
+            </w:r>
+          </w:p>
+        </w:tc>
+      </w:tr>
+      <w:tr>
+        <w:tc>
+          <w:tcPr>
+            <w:tcW w:type="dxa" w:w="1728"/>
+          </w:tcPr>
+          <w:p>
+            <w:r>
+              <w:t>Benchmark-answer retrieval</w:t>
+            </w:r>
+          </w:p>
+        </w:tc>
+        <w:tc>
+          <w:tcPr>
+            <w:tcW w:type="dxa" w:w="1728"/>
+          </w:tcPr>
+          <w:p>
+            <w:r>
+              <w:t>New</w:t>
+            </w:r>
+          </w:p>
+        </w:tc>
+        <w:tc>
+          <w:tcPr>
+            <w:tcW w:type="dxa" w:w="1728"/>
+          </w:tcPr>
+          <w:p>
+            <w:r>
+              <w:t>An agent retrieved, or tried to retrieve, a benchmark answer or a source that fixes it (the benchmark key, another agent's answer, a source paper or dataset) from the web during a run.</w:t>
+            </w:r>
+          </w:p>
+        </w:tc>
+        <w:tc>
+          <w:tcPr>
+            <w:tcW w:type="dxa" w:w="1728"/>
+          </w:tcPr>
+          <w:p>
+            <w:r>
+              <w:t>10 task cases in which a benchmark answer, the key or another agent's answer was obtained</w:t>
+            </w:r>
+          </w:p>
+        </w:tc>
+        <w:tc>
+          <w:tcPr>
+            <w:tcW w:type="dxa" w:w="1728"/>
+          </w:tcPr>
+          <w:p>
+            <w:r>
+              <w:t>answer leakage; cheating</w:t>
+            </w:r>
+          </w:p>
+        </w:tc>
+      </w:tr>
+      <w:tr>
+        <w:tc>
+          <w:tcPr>
+            <w:tcW w:type="dxa" w:w="1728"/>
+          </w:tcPr>
+          <w:p>
+            <w:r>
+              <w:t>Local computation (Galaxy condition)</w:t>
+            </w:r>
+          </w:p>
+        </w:tc>
+        <w:tc>
+          <w:tcPr>
+            <w:tcW w:type="dxa" w:w="1728"/>
+          </w:tcPr>
+          <w:p>
+            <w:r>
+              <w:t>New</w:t>
+            </w:r>
+          </w:p>
+        </w:tc>
+        <w:tc>
+          <w:tcPr>
+            <w:tcW w:type="dxa" w:w="1728"/>
+          </w:tcPr>
+          <w:p>
+            <w:r>
+              <w:t>A Galaxy-condition run whose decisive computation ran in the local shell, with the result only staged into Galaxy, typically after user-defined-tool execution became unavailable on the server. The run keeps its condition label but is not counted as execution within Galaxy.</w:t>
+            </w:r>
+          </w:p>
+        </w:tc>
+        <w:tc>
+          <w:tcPr>
+            <w:tcW w:type="dxa" w:w="1728"/>
+          </w:tcPr>
+          <w:p>
+            <w:r>
+              <w:t>15 scored-correct and 3 scored-incorrect CompBioBench Galaxy-condition runs</w:t>
+            </w:r>
+          </w:p>
+        </w:tc>
+        <w:tc>
+          <w:tcPr>
+            <w:tcW w:type="dxa" w:w="1728"/>
+          </w:tcPr>
+          <w:p>
+            <w:r>
+              <w:t>local fallback</w:t>
+            </w:r>
+          </w:p>
+        </w:tc>
+      </w:tr>
+      <w:tr>
+        <w:tc>
+          <w:tcPr>
+            <w:tcW w:type="dxa" w:w="1728"/>
+          </w:tcPr>
+          <w:p>
+            <w:r>
+              <w:t>Cross-run output reuse</w:t>
+            </w:r>
+          </w:p>
+        </w:tc>
+        <w:tc>
+          <w:tcPr>
+            <w:tcW w:type="dxa" w:w="1728"/>
+          </w:tcPr>
+          <w:p>
+            <w:r>
+              <w:t>New</w:t>
+            </w:r>
+          </w:p>
+        </w:tc>
+        <w:tc>
+          <w:tcPr>
+            <w:tcW w:type="dxa" w:w="1728"/>
+          </w:tcPr>
+          <w:p>
+            <w:r>
+              <w:t>A run that obtained its answer from the analysis history or job outputs of another run through the shared Galaxy account.</w:t>
+            </w:r>
+          </w:p>
+        </w:tc>
+        <w:tc>
+          <w:tcPr>
+            <w:tcW w:type="dxa" w:w="1728"/>
+          </w:tcPr>
+          <w:p>
+            <w:r>
+              <w:t>GPT-5.6 Luna, encode-atac-pipeline-q1, Galaxy condition, replicate run 1</w:t>
+            </w:r>
+          </w:p>
+        </w:tc>
+        <w:tc>
+          <w:tcPr>
+            <w:tcW w:type="dxa" w:w="1728"/>
+          </w:tcPr>
+          <w:p>
+            <w:r>
+              <w:t>answer copying</w:t>
+            </w:r>
+          </w:p>
+        </w:tc>
+      </w:tr>
+      <w:tr>
+        <w:tc>
+          <w:tcPr>
+            <w:tcW w:type="dxa" w:w="1728"/>
+          </w:tcPr>
+          <w:p>
+            <w:r>
+              <w:t>Interface-binding failure</w:t>
+            </w:r>
+          </w:p>
+        </w:tc>
+        <w:tc>
+          <w:tcPr>
+            <w:tcW w:type="dxa" w:w="1728"/>
+          </w:tcPr>
+          <w:p>
+            <w:r>
+              <w:t>New</w:t>
+            </w:r>
+          </w:p>
+        </w:tc>
+        <w:tc>
+          <w:tcPr>
+            <w:tcW w:type="dxa" w:w="1728"/>
+          </w:tcPr>
+          <w:p>
+            <w:r>
+              <w:t>An executed parameter substitution that changes the analysis: Galaxy binds the requested tool state to a different option (for example the default of a nested conditional) and the job succeeds, so no error is returned.</w:t>
+            </w:r>
+          </w:p>
+        </w:tc>
+        <w:tc>
+          <w:tcPr>
+            <w:tcW w:type="dxa" w:w="1728"/>
+          </w:tcPr>
+          <w:p>
+            <w:r>
+              <w:t>bix-35-q1: PhyKIT ran "total tree length" instead of "evolutionary rate"</w:t>
+            </w:r>
+          </w:p>
+        </w:tc>
+        <w:tc>
+          <w:tcPr>
+            <w:tcW w:type="dxa" w:w="1728"/>
+          </w:tcPr>
+          <w:p>
+            <w:r>
+              <w:t>silent default (unqualified)</w:t>
+            </w:r>
+          </w:p>
+        </w:tc>
+      </w:tr>
+      <w:tr>
+        <w:tc>
+          <w:tcPr>
+            <w:tcW w:type="dxa" w:w="1728"/>
+          </w:tcPr>
+          <w:p>
+            <w:r>
               <w:t>Primary cause; secondary cause</w:t>
             </w:r>
           </w:p>
@@ -3160,7 +3628,7 @@
           </w:tcPr>
           <w:p>
             <w:r>
-              <w:t>The main reason, and at most one contributing reason, for a scored-incorrect run (or an IWC run with output agreement below 0.5), assigned by trace-level adjudication from seven categories: task under-specified or reference ambiguous; statistical or reasoning error; evaluator rejected a correct answer; missing domain knowledge; platform or tool defect; no answer submitted; output format violated.</w:t>
+              <w:t>Run level (failure ledger): the main reason, and at most one contributing reason, for a scored-incorrect run (or an IWC run with output agreement below 0.5), assigned by trace-level adjudication from seven categories: task under-specified or reference ambiguous; statistical or reasoning error; evaluator rejected a correct answer; missing domain knowledge; platform or tool defect; no answer submitted; output format violated.</w:t>
             </w:r>
           </w:p>
         </w:tc>

</xml_diff>